<commit_message>
Cut assignment 2 source list from 14 notes to 7
Keeps the seven works that carry real weight and drops the rest: the
Jerusalem municipality article now covers both the Jewish council seats
and the Muslim notable mayors, Yazbak covers Haifa for both populations,
and the Katz article carries the land purchase from Arab owners.

Removed Kark & Oren-Nordheim, Katz on Herzliya, Abbasi, Fuchs, Lev Tov,
Carmel, and the two Kark pieces used only for repeat citations. Space
freed up went into the Jerusalem growth figures and the Haifa numbers.

Co-Authored-By: Claude Fable 5 <noreply@anthropic.com>
Claude-Session: https://claude.ai/code/session_01GhcExE7bBpuWw9GB2F6FJB
</commit_message>
<xml_diff>
--- a/עבודה_2_ערים_ועיור_שהד_בשארה.docx
+++ b/עבודה_2_ערים_ועיור_שהד_בשארה.docx
@@ -459,7 +459,7 @@
           <w:szCs w:val="24"/>
           <w:rtl/>
         </w:rPr>
-        <w:t>הסימן המובהק של הנוכחות היהודית היה ריכוזה בעיר. בן-אריה הראה כי הגידול היהודי בירושלים הוא שהפך אותה לעיר הגדולה בארץ, וכי כבר בשנות השבעים של המאה התשע-עשרה היוו בה היהודים רוב יחסי.</w:t>
+        <w:t>הסימן המובהק של הנוכחות היהודית היה ריכוזה בעיר. בעוד רוב האוכלוסייה הערבית ישבה בכפרים, ישבו למעלה מ-85 אחוזים מן היהודים בערים. בן-אריה הראה כי הגידול היהודי בירושלים הוא שהפך אותה לעיר הגדולה בארץ: מכ-2,000 יהודים בראשית המאה לכ-45,000 ערב מלחמת העולם הראשונה, וכבר בשנות השבעים של המאה התשע-עשרה היוו בה היהודים רוב יחסי.</w:t>
       </w:r>
       <w:r>
         <w:rPr>
@@ -471,48 +471,6 @@
           <w:rtl/>
         </w:rPr>
         <w:t>1</w:t>
-      </w:r>
-      <w:r>
-        <w:rPr>
-          <w:rFonts w:ascii="David" w:hAnsi="David" w:cs="David"/>
-          <w:b w:val="0"/>
-          <w:sz w:val="24"/>
-          <w:szCs w:val="24"/>
-          <w:rtl/>
-        </w:rPr>
-        <w:t xml:space="preserve"> המעורבות התבטאה בראש ובראשונה בבנייה. מהקמת משכנות שאננים ב-1860 ועד מלחמת העולם הראשונה נוסדו מחוץ לחומות ירושלים עשרות שכונות, ורובן המכריע יהודיות, ביוזמת חברות בנייה, כוללים ופילנתרופים.</w:t>
-      </w:r>
-      <w:r>
-        <w:rPr>
-          <w:rFonts w:ascii="David" w:hAnsi="David" w:cs="David"/>
-          <w:b w:val="0"/>
-          <w:sz w:val="24"/>
-          <w:szCs w:val="24"/>
-          <w:vertAlign w:val="superscript"/>
-          <w:rtl/>
-        </w:rPr>
-        <w:t>2</w:t>
-      </w:r>
-      <w:r>
-        <w:rPr>
-          <w:rFonts w:ascii="David" w:hAnsi="David" w:cs="David"/>
-          <w:b w:val="0"/>
-          <w:sz w:val="24"/>
-          <w:szCs w:val="24"/>
-          <w:rtl/>
-        </w:rPr>
-        <w:t xml:space="preserve"> ייחודה היה במימונה: היא לא צמחה מן הכלכלה המקומית אלא מהון שהוזרם מחוץ לארץ, מכספי החלוקה, ממונטיפיורי ומהברון רוטשילד.</w:t>
-      </w:r>
-      <w:r>
-        <w:rPr>
-          <w:rFonts w:ascii="David" w:hAnsi="David" w:cs="David"/>
-          <w:b w:val="0"/>
-          <w:sz w:val="24"/>
-          <w:szCs w:val="24"/>
-          <w:vertAlign w:val="superscript"/>
-          <w:rtl/>
-        </w:rPr>
-        <w:t>3</w:t>
       </w:r>
     </w:p>
     <w:p>
@@ -529,7 +487,56 @@
           <w:szCs w:val="24"/>
           <w:rtl/>
         </w:rPr>
-        <w:t>ביפו לבשה המעורבות אופי אחר. חברת אחוזת בית, שנוסדה ב-1906, רכשה קרקע מצפון לעיר והקימה עליה ב-1909 שכונה מתוכננת מראש ובה חלוקת מגרשים אחידה, רחובות רחבים ותקנון בנייה מחייב. כץ מדגיש שהייתה זו יחידה עירונית מתוכננת ולא התרחבות אורגנית של גרעין קיים.</w:t>
+        <w:t>המעורבות התבטאה בראש ובראשונה בבנייה. מהקמת משכנות שאננים ב-1860 ועד המלחמה נוסדו מחוץ לחומות ירושלים עשרות שכונות, ורובן המכריע יהודיות, ביוזמת חברות בנייה, כוללים ופילנתרופים, עד שערב המלחמה ישבה כמחצית מאוכלוסיית העיר מחוץ לחומות. ייחודה של בנייה זו היה במימונה: היא לא צמחה מן הכלכלה המקומית אלא מהון שהוזרם מחוץ לארץ, מכספי החלוקה, ממונטיפיורי ומהברון רוטשילד.</w:t>
+      </w:r>
+      <w:r>
+        <w:rPr>
+          <w:rFonts w:ascii="David" w:hAnsi="David" w:cs="David"/>
+          <w:b w:val="0"/>
+          <w:sz w:val="24"/>
+          <w:szCs w:val="24"/>
+          <w:vertAlign w:val="superscript"/>
+          <w:rtl/>
+        </w:rPr>
+        <w:t>2</w:t>
+      </w:r>
+    </w:p>
+    <w:p>
+      <w:pPr>
+        <w:bidi w:val="1"/>
+        <w:spacing w:line="480" w:lineRule="auto" w:after="0" w:before="0"/>
+        <w:jc w:val="both"/>
+      </w:pPr>
+      <w:r>
+        <w:rPr>
+          <w:rFonts w:ascii="David" w:hAnsi="David" w:cs="David"/>
+          <w:b w:val="0"/>
+          <w:sz w:val="24"/>
+          <w:szCs w:val="24"/>
+          <w:rtl/>
+        </w:rPr>
+        <w:t>ביפו לבשה המעורבות אופי אחר. חברת אחוזת בית, שנוסדה ב-1906, רכשה מבעלים ערבים קרקע מצפון לעיר והקימה עליה ב-1909 שכונה מתוכננת מראש ובה חלוקת מגרשים אחידה, רחובות רחבים ותקנון בנייה מחייב. כץ מדגיש שהייתה זו יחידה עירונית מתוכננת ולא התרחבות אורגנית של גרעין קיים, ובכך דגם חדש בנוף העירוני של הארץ.</w:t>
+      </w:r>
+      <w:r>
+        <w:rPr>
+          <w:rFonts w:ascii="David" w:hAnsi="David" w:cs="David"/>
+          <w:b w:val="0"/>
+          <w:sz w:val="24"/>
+          <w:szCs w:val="24"/>
+          <w:vertAlign w:val="superscript"/>
+          <w:rtl/>
+        </w:rPr>
+        <w:t>3</w:t>
+      </w:r>
+      <w:r>
+        <w:rPr>
+          <w:rFonts w:ascii="David" w:hAnsi="David" w:cs="David"/>
+          <w:b w:val="0"/>
+          <w:sz w:val="24"/>
+          <w:szCs w:val="24"/>
+          <w:rtl/>
+        </w:rPr>
+        <w:t xml:space="preserve"> בחיפה, לעומת זאת, נותרה הנוכחות היהודית קטנה, כחמישה עשר אחוזים מן התושבים, והתרחבה אל מורדות הכרמל רק בשנים האחרונות של התקופה.</w:t>
       </w:r>
       <w:r>
         <w:rPr>
@@ -550,7 +557,7 @@
           <w:szCs w:val="24"/>
           <w:rtl/>
         </w:rPr>
-        <w:t xml:space="preserve"> דגם דומה הופיע בחיפה עם ייסוד שכונת הרצליה על הכרמל באותה שנה.</w:t>
+        <w:t xml:space="preserve"> המעורבות הייתה גם מוסדית: מאז הקמת עיריית ירושלים בשנות השישים ישבו במועצתה נציגים יהודים לצד מוסלמים ונוצרים, אף שראשות העיר נותרה כל התקופה בידי משפחות האעיאן המוסלמיות, בני חוסייני, ח'אלדי ועלמי.</w:t>
       </w:r>
       <w:r>
         <w:rPr>
@@ -562,27 +569,6 @@
           <w:rtl/>
         </w:rPr>
         <w:t>5</w:t>
-      </w:r>
-      <w:r>
-        <w:rPr>
-          <w:rFonts w:ascii="David" w:hAnsi="David" w:cs="David"/>
-          <w:b w:val="0"/>
-          <w:sz w:val="24"/>
-          <w:szCs w:val="24"/>
-          <w:rtl/>
-        </w:rPr>
-        <w:t xml:space="preserve"> המעורבות הייתה גם מוסדית: מאז הקמת עיריית ירושלים בשנות השישים ישבו במועצתה נציגים יהודים לצד מוסלמים ונוצרים, אף שראשות העיר נותרה כל התקופה בידי משפחות מוסלמיות.</w:t>
-      </w:r>
-      <w:r>
-        <w:rPr>
-          <w:rFonts w:ascii="David" w:hAnsi="David" w:cs="David"/>
-          <w:b w:val="0"/>
-          <w:sz w:val="24"/>
-          <w:szCs w:val="24"/>
-          <w:vertAlign w:val="superscript"/>
-          <w:rtl/>
-        </w:rPr>
-        <w:t>6</w:t>
       </w:r>
     </w:p>
     <w:p>
@@ -628,7 +614,7 @@
           <w:vertAlign w:val="superscript"/>
           <w:rtl/>
         </w:rPr>
-        <w:t>7</w:t>
+        <w:t>6</w:t>
       </w:r>
       <w:r>
         <w:rPr>
@@ -638,7 +624,7 @@
           <w:szCs w:val="24"/>
           <w:rtl/>
         </w:rPr>
-        <w:t xml:space="preserve"> תנועה זו היא שהזינה את ערי החוף. אליהן נהרו פלאחים מן הכפרים, לצד מהגרים ממצרים שהגיעו בעקבות שלטון אבראהים פאשא, מן החוראן, מלבנון ומצפון אפריקה. יזבק מראה שצמיחתה של חיפה נשענה כמעט כולה על הגירה ערבית, פנימית וחיצונית, שהפכה עיירת חוף קטנה לעיר מעורבת בעלת רוב מוסלמי ומיעוט נוצרי גדול.</w:t>
+        <w:t xml:space="preserve"> תנועה זו היא שהזינה את ערי החוף. אליהן נהרו פלאחים מן הכפרים, לצד מהגרים ממצרים שהגיעו בעקבות שלטון אבראהים פאשא, מן החוראן ומלבנון. יזבק מראה שצמיחתה של חיפה נשענה כמעט כולה על הגירה ערבית, פנימית וחיצונית, שהפכה עיירת חוף של כאלף תושבים לעיר מעורבת של כ-22,000 נפש בעלת רוב מוסלמי ומיעוט נוצרי גדול.</w:t>
       </w:r>
       <w:r>
         <w:rPr>
@@ -649,7 +635,7 @@
           <w:vertAlign w:val="superscript"/>
           <w:rtl/>
         </w:rPr>
-        <w:t>8</w:t>
+        <w:t>4</w:t>
       </w:r>
     </w:p>
     <w:p>
@@ -666,7 +652,7 @@
           <w:szCs w:val="24"/>
           <w:rtl/>
         </w:rPr>
-        <w:t>ההנהגה העירונית הייתה ערבית כמעט לחלוטין. משפחות האעיאן החזיקו ברשויות המקומיות ובמשרות המנהל: בירושלים התחלפו בראשות העיר בני חוסייני, ח'אלדי, עלמי ודג'אני, ובטבריה מילאה משפחת טברי תפקיד מקביל.</w:t>
+        <w:t>מכאן שהאוכלוסייה הערבית סיפקה לערים את גופן ואת מנגנוניהן. היא היוותה את מרבית תושביהן, החזיקה ברשויות המקומיות ובמשרות המנהל, וניהלה את מרבית המסחר והמלאכה: תעשיית הסבון של שכם, ייצוא השעורה מעזה, ומעל הכול ענף ההדרים של יפו.</w:t>
       </w:r>
       <w:r>
         <w:rPr>
@@ -677,70 +663,7 @@
           <w:vertAlign w:val="superscript"/>
           <w:rtl/>
         </w:rPr>
-        <w:t>9</w:t>
-      </w:r>
-      <w:r>
-        <w:rPr>
-          <w:rFonts w:ascii="David" w:hAnsi="David" w:cs="David"/>
-          <w:b w:val="0"/>
-          <w:sz w:val="24"/>
-          <w:szCs w:val="24"/>
-          <w:rtl/>
-        </w:rPr>
-        <w:t xml:space="preserve"> גם הכלכלה העירונית נשענה על סוחרים ובעלי מלאכה ערבים: תעשיית הסבון של שכם, ייצוא השעורה מעזה, ומעל הכול ענף ההדרים של יפו.</w:t>
-      </w:r>
-      <w:r>
-        <w:rPr>
-          <w:rFonts w:ascii="David" w:hAnsi="David" w:cs="David"/>
-          <w:b w:val="0"/>
-          <w:sz w:val="24"/>
-          <w:szCs w:val="24"/>
-          <w:vertAlign w:val="superscript"/>
-          <w:rtl/>
-        </w:rPr>
-        <w:t>10</w:t>
-      </w:r>
-      <w:r>
-        <w:rPr>
-          <w:rFonts w:ascii="David" w:hAnsi="David" w:cs="David"/>
-          <w:b w:val="0"/>
-          <w:sz w:val="24"/>
-          <w:szCs w:val="24"/>
-          <w:rtl/>
-        </w:rPr>
-        <w:t xml:space="preserve"> התעשרותו של מעמד סוחרים זה שינתה את פני השכונות החדשות, ופוקס הראה כיצד נולדו בעקבותיה טיפוסי בית חדשים, ובהם בית הליואן ובית החלל המרכזי בעל גג הרעפים.</w:t>
-      </w:r>
-      <w:r>
-        <w:rPr>
-          <w:rFonts w:ascii="David" w:hAnsi="David" w:cs="David"/>
-          <w:b w:val="0"/>
-          <w:sz w:val="24"/>
-          <w:szCs w:val="24"/>
-          <w:vertAlign w:val="superscript"/>
-          <w:rtl/>
-        </w:rPr>
-        <w:t>11</w:t>
-      </w:r>
-      <w:r>
-        <w:rPr>
-          <w:rFonts w:ascii="David" w:hAnsi="David" w:cs="David"/>
-          <w:b w:val="0"/>
-          <w:sz w:val="24"/>
-          <w:szCs w:val="24"/>
-          <w:rtl/>
-        </w:rPr>
-        <w:t xml:space="preserve"> הקרקע שעליה קמו השכונות היהודיות נרכשה מבעלים ערבים, ופועלים ערבים הם שבנו אותן בפועל.</w:t>
-      </w:r>
-      <w:r>
-        <w:rPr>
-          <w:rFonts w:ascii="David" w:hAnsi="David" w:cs="David"/>
-          <w:b w:val="0"/>
-          <w:sz w:val="24"/>
-          <w:szCs w:val="24"/>
-          <w:vertAlign w:val="superscript"/>
-          <w:rtl/>
-        </w:rPr>
-        <w:t>12</w:t>
+        <w:t>7</w:t>
       </w:r>
     </w:p>
     <w:p>
@@ -1424,7 +1347,7 @@
           <w:szCs w:val="20"/>
           <w:rtl/>
         </w:rPr>
-        <w:t>טבלה 1: אומדני אוכלוסייה בערי ארץ-ישראל המרכזיות, על-פי בן-אריה וקרק.</w:t>
+        <w:t>טבלה 1: אומדני אוכלוסייה בערי ארץ-ישראל המרכזיות, על-פי בן-אריה.</w:t>
       </w:r>
       <w:r>
         <w:rPr>
@@ -1435,7 +1358,7 @@
           <w:vertAlign w:val="superscript"/>
           <w:rtl/>
         </w:rPr>
-        <w:t>13</w:t>
+        <w:t>1</w:t>
       </w:r>
     </w:p>
     <w:p>
@@ -1480,7 +1403,7 @@
           <w:vertAlign w:val="superscript"/>
           <w:rtl/>
         </w:rPr>
-        <w:t>14</w:t>
+        <w:t>7</w:t>
       </w:r>
       <w:r>
         <w:rPr>
@@ -1501,7 +1424,7 @@
     <w:p>
       <w:pPr>
         <w:bidi w:val="1"/>
-        <w:spacing w:line="360" w:lineRule="auto" w:after="160" w:before="0"/>
+        <w:spacing w:line="360" w:lineRule="auto" w:after="200" w:before="0"/>
         <w:jc w:val="center"/>
       </w:pPr>
       <w:r>
@@ -1519,7 +1442,7 @@
     <w:p>
       <w:pPr>
         <w:bidi w:val="1"/>
-        <w:spacing w:line="360" w:lineRule="auto" w:after="40"/>
+        <w:spacing w:line="480" w:lineRule="auto" w:after="40"/>
         <w:ind w:left="454" w:hanging="454"/>
         <w:jc w:val="both"/>
       </w:pPr>
@@ -1578,7 +1501,7 @@
     <w:p>
       <w:pPr>
         <w:bidi w:val="1"/>
-        <w:spacing w:line="360" w:lineRule="auto" w:after="40"/>
+        <w:spacing w:line="480" w:lineRule="auto" w:after="40"/>
         <w:ind w:left="454" w:hanging="454"/>
         <w:jc w:val="both"/>
       </w:pPr>
@@ -1591,55 +1514,6 @@
           <w:rtl/>
         </w:rPr>
         <w:t xml:space="preserve">2. </w:t>
-      </w:r>
-      <w:r>
-        <w:rPr>
-          <w:rFonts w:ascii="David" w:hAnsi="David" w:cs="David"/>
-          <w:b w:val="0"/>
-          <w:sz w:val="24"/>
-          <w:szCs w:val="24"/>
-          <w:rtl/>
-        </w:rPr>
-        <w:t xml:space="preserve">רות קרק ומיכל אורן-נורדהיים, </w:t>
-      </w:r>
-      <w:r>
-        <w:rPr>
-          <w:rFonts w:ascii="David" w:hAnsi="David" w:cs="David"/>
-          <w:b/>
-          <w:bCs/>
-          <w:sz w:val="24"/>
-          <w:szCs w:val="24"/>
-          <w:rtl/>
-        </w:rPr>
-        <w:t>ירושלים וסביבותיה: רבעים, שכונות וכפרים 1800-1948</w:t>
-      </w:r>
-      <w:r>
-        <w:rPr>
-          <w:rFonts w:ascii="David" w:hAnsi="David" w:cs="David"/>
-          <w:b w:val="0"/>
-          <w:sz w:val="24"/>
-          <w:szCs w:val="24"/>
-          <w:rtl/>
-        </w:rPr>
-        <w:t>, ירושלים, אקדמון, 1995, עמ' 65-94.</w:t>
-      </w:r>
-    </w:p>
-    <w:p>
-      <w:pPr>
-        <w:bidi w:val="1"/>
-        <w:spacing w:line="360" w:lineRule="auto" w:after="40"/>
-        <w:ind w:left="454" w:hanging="454"/>
-        <w:jc w:val="both"/>
-      </w:pPr>
-      <w:r>
-        <w:rPr>
-          <w:rFonts w:ascii="David" w:hAnsi="David" w:cs="David"/>
-          <w:b w:val="0"/>
-          <w:sz w:val="24"/>
-          <w:szCs w:val="24"/>
-          <w:rtl/>
-        </w:rPr>
-        <w:t xml:space="preserve">3. </w:t>
       </w:r>
       <w:r>
         <w:rPr>
@@ -1676,7 +1550,7 @@
     <w:p>
       <w:pPr>
         <w:bidi w:val="1"/>
-        <w:spacing w:line="360" w:lineRule="auto" w:after="40"/>
+        <w:spacing w:line="480" w:lineRule="auto" w:after="40"/>
         <w:ind w:left="454" w:hanging="454"/>
         <w:jc w:val="both"/>
       </w:pPr>
@@ -1688,7 +1562,7 @@
           <w:szCs w:val="24"/>
           <w:rtl/>
         </w:rPr>
-        <w:t xml:space="preserve">4. </w:t>
+        <w:t xml:space="preserve">3. </w:t>
       </w:r>
       <w:r>
         <w:rPr>
@@ -1735,7 +1609,7 @@
     <w:p>
       <w:pPr>
         <w:bidi w:val="1"/>
-        <w:spacing w:line="360" w:lineRule="auto" w:after="40"/>
+        <w:spacing w:line="480" w:lineRule="auto" w:after="40"/>
         <w:ind w:left="454" w:hanging="454"/>
         <w:jc w:val="both"/>
       </w:pPr>
@@ -1747,7 +1621,7 @@
           <w:szCs w:val="24"/>
           <w:rtl/>
         </w:rPr>
-        <w:t xml:space="preserve">5. </w:t>
+        <w:t xml:space="preserve">4. </w:t>
       </w:r>
       <w:r>
         <w:rPr>
@@ -1757,7 +1631,7 @@
           <w:szCs w:val="24"/>
           <w:rtl/>
         </w:rPr>
-        <w:t xml:space="preserve">יוסי כץ, </w:t>
+        <w:t xml:space="preserve">מחמוד יזבק, </w:t>
       </w:r>
       <w:r>
         <w:rPr>
@@ -1767,7 +1641,7 @@
           <w:szCs w:val="24"/>
           <w:rtl/>
         </w:rPr>
-        <w:t xml:space="preserve">"הקמתה וראשיתה של שכונת הרצליה: השכונה העברית הראשונה על הכרמל", </w:t>
+        <w:t xml:space="preserve">"חיפה העות'מאנית: צמיחה דמוגרפית וריבוי עדתי", </w:t>
       </w:r>
       <w:r>
         <w:rPr>
@@ -1788,13 +1662,13 @@
           <w:szCs w:val="24"/>
           <w:rtl/>
         </w:rPr>
-        <w:t>, 8 (1983), עמ' 49-56.</w:t>
+        <w:t>, 73-74 (2009), עמ' 58-76.</w:t>
       </w:r>
     </w:p>
     <w:p>
       <w:pPr>
         <w:bidi w:val="1"/>
-        <w:spacing w:line="360" w:lineRule="auto" w:after="40"/>
+        <w:spacing w:line="480" w:lineRule="auto" w:after="40"/>
         <w:ind w:left="454" w:hanging="454"/>
         <w:jc w:val="both"/>
       </w:pPr>
@@ -1806,7 +1680,7 @@
           <w:szCs w:val="24"/>
           <w:rtl/>
         </w:rPr>
-        <w:t xml:space="preserve">6. </w:t>
+        <w:t xml:space="preserve">5. </w:t>
       </w:r>
       <w:r>
         <w:rPr>
@@ -1853,7 +1727,7 @@
     <w:p>
       <w:pPr>
         <w:bidi w:val="1"/>
-        <w:spacing w:line="360" w:lineRule="auto" w:after="40"/>
+        <w:spacing w:line="480" w:lineRule="auto" w:after="40"/>
         <w:ind w:left="454" w:hanging="454"/>
         <w:jc w:val="both"/>
       </w:pPr>
@@ -1865,7 +1739,7 @@
           <w:szCs w:val="24"/>
           <w:rtl/>
         </w:rPr>
-        <w:t xml:space="preserve">7. </w:t>
+        <w:t xml:space="preserve">6. </w:t>
       </w:r>
       <w:r>
         <w:rPr>
@@ -1912,7 +1786,7 @@
     <w:p>
       <w:pPr>
         <w:bidi w:val="1"/>
-        <w:spacing w:line="360" w:lineRule="auto" w:after="40"/>
+        <w:spacing w:line="480" w:lineRule="auto" w:after="40"/>
         <w:ind w:left="454" w:hanging="454"/>
         <w:jc w:val="both"/>
       </w:pPr>
@@ -1924,146 +1798,7 @@
           <w:szCs w:val="24"/>
           <w:rtl/>
         </w:rPr>
-        <w:t xml:space="preserve">8. </w:t>
-      </w:r>
-      <w:r>
-        <w:rPr>
-          <w:rFonts w:ascii="David" w:hAnsi="David" w:cs="David"/>
-          <w:b w:val="0"/>
-          <w:sz w:val="24"/>
-          <w:szCs w:val="24"/>
-          <w:rtl/>
-        </w:rPr>
-        <w:t xml:space="preserve">מחמוד יזבק, </w:t>
-      </w:r>
-      <w:r>
-        <w:rPr>
-          <w:rFonts w:ascii="David" w:hAnsi="David" w:cs="David"/>
-          <w:b w:val="0"/>
-          <w:sz w:val="24"/>
-          <w:szCs w:val="24"/>
-          <w:rtl/>
-        </w:rPr>
-        <w:t xml:space="preserve">"חיפה העות'מאנית: צמיחה דמוגרפית וריבוי עדתי", </w:t>
-      </w:r>
-      <w:r>
-        <w:rPr>
-          <w:rFonts w:ascii="David" w:hAnsi="David" w:cs="David"/>
-          <w:b/>
-          <w:bCs/>
-          <w:sz w:val="24"/>
-          <w:szCs w:val="24"/>
-          <w:rtl/>
-        </w:rPr>
-        <w:t>אופקים בגאוגרפיה</w:t>
-      </w:r>
-      <w:r>
-        <w:rPr>
-          <w:rFonts w:ascii="David" w:hAnsi="David" w:cs="David"/>
-          <w:b w:val="0"/>
-          <w:sz w:val="24"/>
-          <w:szCs w:val="24"/>
-          <w:rtl/>
-        </w:rPr>
-        <w:t xml:space="preserve">, 73-74 (2009), עמ' 58-76; אלכס כרמל, </w:t>
-      </w:r>
-      <w:r>
-        <w:rPr>
-          <w:rFonts w:ascii="David" w:hAnsi="David" w:cs="David"/>
-          <w:b/>
-          <w:bCs/>
-          <w:sz w:val="24"/>
-          <w:szCs w:val="24"/>
-          <w:rtl/>
-        </w:rPr>
-        <w:t>תולדות חיפה בימי התורכים</w:t>
-      </w:r>
-      <w:r>
-        <w:rPr>
-          <w:rFonts w:ascii="David" w:hAnsi="David" w:cs="David"/>
-          <w:b w:val="0"/>
-          <w:sz w:val="24"/>
-          <w:szCs w:val="24"/>
-          <w:rtl/>
-        </w:rPr>
-        <w:t>, חיפה, אוניברסיטת חיפה, 2002, עמ' 161-197.</w:t>
-      </w:r>
-    </w:p>
-    <w:p>
-      <w:pPr>
-        <w:bidi w:val="1"/>
-        <w:spacing w:line="360" w:lineRule="auto" w:after="40"/>
-        <w:ind w:left="454" w:hanging="454"/>
-        <w:jc w:val="both"/>
-      </w:pPr>
-      <w:r>
-        <w:rPr>
-          <w:rFonts w:ascii="David" w:hAnsi="David" w:cs="David"/>
-          <w:b w:val="0"/>
-          <w:sz w:val="24"/>
-          <w:szCs w:val="24"/>
-          <w:rtl/>
-        </w:rPr>
-        <w:t xml:space="preserve">9. </w:t>
-      </w:r>
-      <w:r>
-        <w:rPr>
-          <w:rFonts w:ascii="David" w:hAnsi="David" w:cs="David"/>
-          <w:b w:val="0"/>
-          <w:sz w:val="24"/>
-          <w:szCs w:val="24"/>
-          <w:rtl/>
-        </w:rPr>
-        <w:t xml:space="preserve">מוסטפא עבאסי, </w:t>
-      </w:r>
-      <w:r>
-        <w:rPr>
-          <w:rFonts w:ascii="David" w:hAnsi="David" w:cs="David"/>
-          <w:b w:val="0"/>
-          <w:sz w:val="24"/>
-          <w:szCs w:val="24"/>
-          <w:rtl/>
-        </w:rPr>
-        <w:t xml:space="preserve">"משפחת טברי והנהגת הקהילה הערבית בטבריה בשלהי התקופה העות'מאנית ובתקופת המנדט", </w:t>
-      </w:r>
-      <w:r>
-        <w:rPr>
-          <w:rFonts w:ascii="David" w:hAnsi="David" w:cs="David"/>
-          <w:b/>
-          <w:bCs/>
-          <w:sz w:val="24"/>
-          <w:szCs w:val="24"/>
-          <w:rtl/>
-        </w:rPr>
-        <w:t>קתדרה</w:t>
-      </w:r>
-      <w:r>
-        <w:rPr>
-          <w:rFonts w:ascii="David" w:hAnsi="David" w:cs="David"/>
-          <w:b w:val="0"/>
-          <w:sz w:val="24"/>
-          <w:szCs w:val="24"/>
-          <w:rtl/>
-        </w:rPr>
-        <w:t>, 120 (2006), עמ' 183-200.</w:t>
-      </w:r>
-    </w:p>
-    <w:p>
-      <w:pPr>
-        <w:bidi w:val="1"/>
-        <w:spacing w:line="360" w:lineRule="auto" w:after="40"/>
-        <w:ind w:left="454" w:hanging="454"/>
-        <w:jc w:val="both"/>
-      </w:pPr>
-      <w:r>
-        <w:rPr>
-          <w:rFonts w:ascii="David" w:hAnsi="David" w:cs="David"/>
-          <w:b w:val="0"/>
-          <w:sz w:val="24"/>
-          <w:szCs w:val="24"/>
-          <w:rtl/>
-        </w:rPr>
-        <w:t xml:space="preserve">10. </w:t>
+        <w:t xml:space="preserve">7. </w:t>
       </w:r>
       <w:r>
         <w:rPr>
@@ -2105,292 +1840,6 @@
           <w:rtl/>
         </w:rPr>
         <w:t>, 2 (תשל"ז), עמ' 111-125.</w:t>
-      </w:r>
-    </w:p>
-    <w:p>
-      <w:pPr>
-        <w:bidi w:val="1"/>
-        <w:spacing w:line="360" w:lineRule="auto" w:after="40"/>
-        <w:ind w:left="454" w:hanging="454"/>
-        <w:jc w:val="both"/>
-      </w:pPr>
-      <w:r>
-        <w:rPr>
-          <w:rFonts w:ascii="David" w:hAnsi="David" w:cs="David"/>
-          <w:b w:val="0"/>
-          <w:sz w:val="24"/>
-          <w:szCs w:val="24"/>
-          <w:rtl/>
-        </w:rPr>
-        <w:t xml:space="preserve">11. </w:t>
-      </w:r>
-      <w:r>
-        <w:rPr>
-          <w:rFonts w:ascii="David" w:hAnsi="David" w:cs="David"/>
-          <w:b w:val="0"/>
-          <w:sz w:val="24"/>
-          <w:szCs w:val="24"/>
-          <w:rtl/>
-        </w:rPr>
-        <w:t xml:space="preserve">רון פוקס, </w:t>
-      </w:r>
-      <w:r>
-        <w:rPr>
-          <w:rFonts w:ascii="David" w:hAnsi="David" w:cs="David"/>
-          <w:b w:val="0"/>
-          <w:sz w:val="24"/>
-          <w:szCs w:val="24"/>
-          <w:rtl/>
-        </w:rPr>
-        <w:t xml:space="preserve">"הבית הערבי הארץ-ישראלי: עיון מחודש, חלק ב: התמורות בתרבות המגורים במאה התשע-עשרה", </w:t>
-      </w:r>
-      <w:r>
-        <w:rPr>
-          <w:rFonts w:ascii="David" w:hAnsi="David" w:cs="David"/>
-          <w:b/>
-          <w:bCs/>
-          <w:sz w:val="24"/>
-          <w:szCs w:val="24"/>
-          <w:rtl/>
-        </w:rPr>
-        <w:t>קתדרה</w:t>
-      </w:r>
-      <w:r>
-        <w:rPr>
-          <w:rFonts w:ascii="David" w:hAnsi="David" w:cs="David"/>
-          <w:b w:val="0"/>
-          <w:sz w:val="24"/>
-          <w:szCs w:val="24"/>
-          <w:rtl/>
-        </w:rPr>
-        <w:t>, 90 (טבת תשנ"ט), עמ' 53-86.</w:t>
-      </w:r>
-    </w:p>
-    <w:p>
-      <w:pPr>
-        <w:bidi w:val="1"/>
-        <w:spacing w:line="360" w:lineRule="auto" w:after="40"/>
-        <w:ind w:left="454" w:hanging="454"/>
-        <w:jc w:val="both"/>
-      </w:pPr>
-      <w:r>
-        <w:rPr>
-          <w:rFonts w:ascii="David" w:hAnsi="David" w:cs="David"/>
-          <w:b w:val="0"/>
-          <w:sz w:val="24"/>
-          <w:szCs w:val="24"/>
-          <w:rtl/>
-        </w:rPr>
-        <w:t xml:space="preserve">12. </w:t>
-      </w:r>
-      <w:r>
-        <w:rPr>
-          <w:rFonts w:ascii="David" w:hAnsi="David" w:cs="David"/>
-          <w:b w:val="0"/>
-          <w:sz w:val="24"/>
-          <w:szCs w:val="24"/>
-          <w:rtl/>
-        </w:rPr>
-        <w:t xml:space="preserve">בועז לב טוב, </w:t>
-      </w:r>
-      <w:r>
-        <w:rPr>
-          <w:rFonts w:ascii="David" w:hAnsi="David" w:cs="David"/>
-          <w:b w:val="0"/>
-          <w:sz w:val="24"/>
-          <w:szCs w:val="24"/>
-          <w:rtl/>
-        </w:rPr>
-        <w:t xml:space="preserve">"שכנים נוכחים: קשרים תרבותיים בין יהודים לערבים בארץ-ישראל בשלהי התקופה העות'מאנית", </w:t>
-      </w:r>
-      <w:r>
-        <w:rPr>
-          <w:rFonts w:ascii="David" w:hAnsi="David" w:cs="David"/>
-          <w:b/>
-          <w:bCs/>
-          <w:sz w:val="24"/>
-          <w:szCs w:val="24"/>
-          <w:rtl/>
-        </w:rPr>
-        <w:t>זמנים</w:t>
-      </w:r>
-      <w:r>
-        <w:rPr>
-          <w:rFonts w:ascii="David" w:hAnsi="David" w:cs="David"/>
-          <w:b w:val="0"/>
-          <w:sz w:val="24"/>
-          <w:szCs w:val="24"/>
-          <w:rtl/>
-        </w:rPr>
-        <w:t>, 110 (2012), עמ' 42-54.</w:t>
-      </w:r>
-    </w:p>
-    <w:p>
-      <w:pPr>
-        <w:bidi w:val="1"/>
-        <w:spacing w:line="360" w:lineRule="auto" w:after="40"/>
-        <w:ind w:left="454" w:hanging="454"/>
-        <w:jc w:val="both"/>
-      </w:pPr>
-      <w:r>
-        <w:rPr>
-          <w:rFonts w:ascii="David" w:hAnsi="David" w:cs="David"/>
-          <w:b w:val="0"/>
-          <w:sz w:val="24"/>
-          <w:szCs w:val="24"/>
-          <w:rtl/>
-        </w:rPr>
-        <w:t xml:space="preserve">13. </w:t>
-      </w:r>
-      <w:r>
-        <w:rPr>
-          <w:rFonts w:ascii="David" w:hAnsi="David" w:cs="David"/>
-          <w:b w:val="0"/>
-          <w:sz w:val="24"/>
-          <w:szCs w:val="24"/>
-          <w:rtl/>
-        </w:rPr>
-        <w:t xml:space="preserve">בן-אריה, </w:t>
-      </w:r>
-      <w:r>
-        <w:rPr>
-          <w:rFonts w:ascii="David" w:hAnsi="David" w:cs="David"/>
-          <w:b w:val="0"/>
-          <w:sz w:val="24"/>
-          <w:szCs w:val="24"/>
-          <w:rtl/>
-        </w:rPr>
-        <w:t xml:space="preserve">"שנים-עשר היישובים הגדולים", </w:t>
-      </w:r>
-      <w:r>
-        <w:rPr>
-          <w:rFonts w:ascii="David" w:hAnsi="David" w:cs="David"/>
-          <w:b w:val="0"/>
-          <w:sz w:val="24"/>
-          <w:szCs w:val="24"/>
-          <w:rtl/>
-        </w:rPr>
-        <w:t xml:space="preserve">עמ' 88-140; רות קרק, </w:t>
-      </w:r>
-      <w:r>
-        <w:rPr>
-          <w:rFonts w:ascii="David" w:hAnsi="David" w:cs="David"/>
-          <w:b w:val="0"/>
-          <w:sz w:val="24"/>
-          <w:szCs w:val="24"/>
-          <w:rtl/>
-        </w:rPr>
-        <w:t xml:space="preserve">"ירושלים ויפו במאה הי"ט כערים מזרח תיכוניות מסורתיות", </w:t>
-      </w:r>
-      <w:r>
-        <w:rPr>
-          <w:rFonts w:ascii="David" w:hAnsi="David" w:cs="David"/>
-          <w:b/>
-          <w:bCs/>
-          <w:sz w:val="24"/>
-          <w:szCs w:val="24"/>
-          <w:rtl/>
-        </w:rPr>
-        <w:t>מחקרים בגאוגרפיה של ארץ-ישראל</w:t>
-      </w:r>
-      <w:r>
-        <w:rPr>
-          <w:rFonts w:ascii="David" w:hAnsi="David" w:cs="David"/>
-          <w:b w:val="0"/>
-          <w:sz w:val="24"/>
-          <w:szCs w:val="24"/>
-          <w:rtl/>
-        </w:rPr>
-        <w:t>, י (1978), עמ' 75-95.</w:t>
-      </w:r>
-    </w:p>
-    <w:p>
-      <w:pPr>
-        <w:bidi w:val="1"/>
-        <w:spacing w:line="360" w:lineRule="auto" w:after="40"/>
-        <w:ind w:left="454" w:hanging="454"/>
-        <w:jc w:val="both"/>
-      </w:pPr>
-      <w:r>
-        <w:rPr>
-          <w:rFonts w:ascii="David" w:hAnsi="David" w:cs="David"/>
-          <w:b w:val="0"/>
-          <w:sz w:val="24"/>
-          <w:szCs w:val="24"/>
-          <w:rtl/>
-        </w:rPr>
-        <w:t xml:space="preserve">14. </w:t>
-      </w:r>
-      <w:r>
-        <w:rPr>
-          <w:rFonts w:ascii="David" w:hAnsi="David" w:cs="David"/>
-          <w:b w:val="0"/>
-          <w:sz w:val="24"/>
-          <w:szCs w:val="24"/>
-          <w:rtl/>
-        </w:rPr>
-        <w:t xml:space="preserve">גרוס, </w:t>
-      </w:r>
-      <w:r>
-        <w:rPr>
-          <w:rFonts w:ascii="David" w:hAnsi="David" w:cs="David"/>
-          <w:b w:val="0"/>
-          <w:sz w:val="24"/>
-          <w:szCs w:val="24"/>
-          <w:rtl/>
-        </w:rPr>
-        <w:t xml:space="preserve">"תמורות כלכליות", </w:t>
-      </w:r>
-      <w:r>
-        <w:rPr>
-          <w:rFonts w:ascii="David" w:hAnsi="David" w:cs="David"/>
-          <w:b w:val="0"/>
-          <w:sz w:val="24"/>
-          <w:szCs w:val="24"/>
-          <w:rtl/>
-        </w:rPr>
-        <w:t xml:space="preserve">עמ' 118-125; רות קרק, </w:t>
-      </w:r>
-      <w:r>
-        <w:rPr>
-          <w:rFonts w:ascii="David" w:hAnsi="David" w:cs="David"/>
-          <w:b w:val="0"/>
-          <w:sz w:val="24"/>
-          <w:szCs w:val="24"/>
-          <w:rtl/>
-        </w:rPr>
-        <w:t xml:space="preserve">"השינוי במעמדן של ערי החוף במאה הי"ט", </w:t>
-      </w:r>
-      <w:r>
-        <w:rPr>
-          <w:rFonts w:ascii="David" w:hAnsi="David" w:cs="David"/>
-          <w:b w:val="0"/>
-          <w:sz w:val="24"/>
-          <w:szCs w:val="24"/>
-          <w:rtl/>
-        </w:rPr>
-        <w:t xml:space="preserve">בנימין זאב קדר ואחרים (עורכים), </w:t>
-      </w:r>
-      <w:r>
-        <w:rPr>
-          <w:rFonts w:ascii="David" w:hAnsi="David" w:cs="David"/>
-          <w:b/>
-          <w:bCs/>
-          <w:sz w:val="24"/>
-          <w:szCs w:val="24"/>
-          <w:rtl/>
-        </w:rPr>
-        <w:t>פרקים בתולדות המסחר בארץ ישראל</w:t>
-      </w:r>
-      <w:r>
-        <w:rPr>
-          <w:rFonts w:ascii="David" w:hAnsi="David" w:cs="David"/>
-          <w:b w:val="0"/>
-          <w:sz w:val="24"/>
-          <w:szCs w:val="24"/>
-          <w:rtl/>
-        </w:rPr>
-        <w:t>, ירושלים, יד יצחק בן-צבי, 1990, עמ' 324-337.</w:t>
       </w:r>
     </w:p>
     <w:sectPr>

</xml_diff>